<commit_message>
Introduced additional probing to extract top-1 accuracy results from multiple points during the greedy and evolutionary optimization process for subset selection.
</commit_message>
<xml_diff>
--- a/EPII_CM55M_APP_S/app/scenario_app/incr_learn/doc/communication_protocol.docx
+++ b/EPII_CM55M_APP_S/app/scenario_app/incr_learn/doc/communication_protocol.docx
@@ -1240,6 +1240,27 @@
               <w:rPr>
                 <w:lang w:val="en-GB"/>
               </w:rPr>
+              <w:t>num_prob</w:t>
+            </w:r>
+            <w:proofErr w:type="spellEnd"/>
+            <w:r>
+              <w:rPr>
+                <w:lang w:val="en-GB"/>
+              </w:rPr>
+              <w:t>,</w:t>
+            </w:r>
+          </w:p>
+          <w:p>
+            <w:pPr>
+              <w:rPr>
+                <w:lang w:val="en-GB"/>
+              </w:rPr>
+            </w:pPr>
+            <w:proofErr w:type="spellStart"/>
+            <w:r>
+              <w:rPr>
+                <w:lang w:val="en-GB"/>
+              </w:rPr>
               <w:t>num_iter</w:t>
             </w:r>
             <w:proofErr w:type="spellEnd"/>
@@ -1445,6 +1466,19 @@
                 <w:lang w:val="en-GB"/>
               </w:rPr>
             </w:pPr>
+            <w:r>
+              <w:rPr>
+                <w:lang w:val="en-GB"/>
+              </w:rPr>
+              <w:t>num_prob,</w:t>
+            </w:r>
+          </w:p>
+          <w:p>
+            <w:pPr>
+              <w:rPr>
+                <w:lang w:val="en-GB"/>
+              </w:rPr>
+            </w:pPr>
             <w:proofErr w:type="spellStart"/>
             <w:r>
               <w:rPr>
@@ -1745,6 +1779,7 @@
               <w:rPr>
                 <w:lang w:val="en-GB"/>
               </w:rPr>
+              <w:lastRenderedPageBreak/>
               <w:t>k_kNN</w:t>
             </w:r>
             <w:proofErr w:type="spellEnd"/>
@@ -1772,6 +1807,7 @@
               <w:rPr>
                 <w:lang w:val="en-GB"/>
               </w:rPr>
+              <w:lastRenderedPageBreak/>
               <w:t>-</w:t>
             </w:r>
           </w:p>
@@ -1816,7 +1852,6 @@
               <w:rPr>
                 <w:lang w:val="en-GB"/>
               </w:rPr>
-              <w:lastRenderedPageBreak/>
               <w:t>set_random_seed</w:t>
             </w:r>
             <w:proofErr w:type="spellEnd"/>

</xml_diff>